<commit_message>
Add Comprehensive Revenue Model section to project report DOCX
</commit_message>
<xml_diff>
--- a/Sports_Infrastructure_Benchmark_Report.docx
+++ b/Sports_Infrastructure_Benchmark_Report.docx
@@ -2279,7 +2279,1508 @@
           <w:color w:val="041A4D"/>
           <w:sz w:val="32"/>
         </w:rPr>
-        <w:t>4. Strategic Recommendations &amp; Technological Edge</w:t>
+        <w:t>4. Comprehensive Business &amp; Revenue Model Analysis</w:t>
+      </w:r>
+    </w:p>
+    <w:p>
+      <w:r>
+        <w:t>Indian Pro League Alliance Corp operates a multi-stream, self-sustaining financial framework designed to bridge grassroots sports development with profitable commercial operation. By monetizing infrastructure usage, B2B vendor procurement, event licensing, PPP investor returns, and franchise sponsorship rights, the company ensures long-term viability without relying solely on government subsidies.</w:t>
+      </w:r>
+    </w:p>
+    <w:p>
+      <w:pPr>
+        <w:spacing w:before="160" w:after="40"/>
+      </w:pPr>
+      <w:r>
+        <w:rPr>
+          <w:rFonts w:ascii="Arial" w:hAnsi="Arial"/>
+          <w:b/>
+          <w:color w:val="9A6815"/>
+          <w:sz w:val="24"/>
+        </w:rPr>
+        <w:t>A. Infrastructure PPP &amp; Landowner Profit Sharing (Core Capital Stream)</w:t>
+      </w:r>
+    </w:p>
+    <w:p>
+      <w:r>
+        <w:t>Landowners contributing 1-3 acres near panchayat highways or district hubs receive a 35% to 40% share of net operational cash flows generated by the sports complexes (court rentals, coaching fees, and evening floodlight matches). Capital investors funding synthetic track/court construction receive a guaranteed 12% - 15% preferred yield plus 20% upside profit share.</w:t>
+      </w:r>
+    </w:p>
+    <w:p>
+      <w:pPr>
+        <w:pStyle w:val="ListBullet"/>
+        <w:spacing w:after="40"/>
+      </w:pPr>
+      <w:r>
+        <w:t>Target Payback Period: 3.5 - 4.2 years per multi-sport complex.</w:t>
+      </w:r>
+    </w:p>
+    <w:p>
+      <w:pPr>
+        <w:pStyle w:val="ListBullet"/>
+        <w:spacing w:after="40"/>
+      </w:pPr>
+      <w:r>
+        <w:t>Facility Monetization: Hourly court booking fees (₹300 - ₹800/hr for wooden badminton &amp; synthetic kabaddi mats).</w:t>
+      </w:r>
+    </w:p>
+    <w:p>
+      <w:pPr>
+        <w:pStyle w:val="ListBullet"/>
+        <w:spacing w:after="40"/>
+      </w:pPr>
+      <w:r>
+        <w:t>Corporate Night Leagues: Leasing facilities to local corporate firms &amp; regional clubs during off-peak hours.</w:t>
+      </w:r>
+    </w:p>
+    <w:p>
+      <w:pPr>
+        <w:spacing w:before="160" w:after="40"/>
+      </w:pPr>
+      <w:r>
+        <w:rPr>
+          <w:rFonts w:ascii="Arial" w:hAnsi="Arial"/>
+          <w:b/>
+          <w:color w:val="9A6815"/>
+          <w:sz w:val="24"/>
+        </w:rPr>
+        <w:t>B. B2B Vendor Procurement &amp; Equipment Marketplace Commission</w:t>
+      </w:r>
+    </w:p>
+    <w:p>
+      <w:r>
+        <w:t>All equipment vendors, synthetic turf contractors, racket manufacturers, and apparel suppliers listed on the CMS platform undergo verification. The corporation levies a 3% to 7% transaction fee on all bulk procurement orders processed through the platform.</w:t>
+      </w:r>
+    </w:p>
+    <w:p>
+      <w:pPr>
+        <w:pStyle w:val="ListBullet"/>
+        <w:spacing w:after="40"/>
+      </w:pPr>
+      <w:r>
+        <w:t>Wholesale Supply Licensing: Verified vendors pay an annual portal listing fee (₹15,000 - ₹50,000/year).</w:t>
+      </w:r>
+    </w:p>
+    <w:p>
+      <w:pPr>
+        <w:pStyle w:val="ListBullet"/>
+        <w:spacing w:after="40"/>
+      </w:pPr>
+      <w:r>
+        <w:t>Bulk Equipment Kits: Commission earned on direct sales of badminton rackets, shuttlecocks, athletics shoes, and aquatic gear to school districts and sports hubs.</w:t>
+      </w:r>
+    </w:p>
+    <w:p>
+      <w:pPr>
+        <w:pStyle w:val="ListBullet"/>
+        <w:spacing w:after="40"/>
+      </w:pPr>
+      <w:r>
+        <w:t>Infrastructure Contracting Bids: 2.5% platform fee on turnkey turf and lighting construction contracts.</w:t>
+      </w:r>
+    </w:p>
+    <w:p>
+      <w:pPr>
+        <w:spacing w:before="160" w:after="40"/>
+      </w:pPr>
+      <w:r>
+        <w:rPr>
+          <w:rFonts w:ascii="Arial" w:hAnsi="Arial"/>
+          <w:b/>
+          <w:color w:val="9A6815"/>
+          <w:sz w:val="24"/>
+        </w:rPr>
+        <w:t>C. Event Calendar, Tournament Entry &amp; Player Academy Licensing</w:t>
+      </w:r>
+    </w:p>
+    <w:p>
+      <w:r>
+        <w:t>The portal hosts official ranking tournaments (e.g., MP State Youth Badminton Championship, Panchayat Athletics Talent Hunt). Revenue is generated through nominal athlete registration fees, academy affiliation licensing, and talent scouting assessment packages.</w:t>
+      </w:r>
+    </w:p>
+    <w:p>
+      <w:pPr>
+        <w:pStyle w:val="ListBullet"/>
+        <w:spacing w:after="40"/>
+      </w:pPr>
+      <w:r>
+        <w:t>Tournament Entry Fees: ₹200 - ₹500 per athlete per event (10,000+ participating athletes across state trials).</w:t>
+      </w:r>
+    </w:p>
+    <w:p>
+      <w:pPr>
+        <w:pStyle w:val="ListBullet"/>
+        <w:spacing w:after="40"/>
+      </w:pPr>
+      <w:r>
+        <w:t>Affiliated Coaching Academies: Annual affiliation fee (₹25,000/year per district coaching center).</w:t>
+      </w:r>
+    </w:p>
+    <w:p>
+      <w:pPr>
+        <w:pStyle w:val="ListBullet"/>
+        <w:spacing w:after="40"/>
+      </w:pPr>
+      <w:r>
+        <w:t>Performance Data Analytics Subscriptions: Premium analytics reports for talent scouts and sports agencies.</w:t>
+      </w:r>
+    </w:p>
+    <w:p>
+      <w:pPr>
+        <w:spacing w:before="160" w:after="40"/>
+      </w:pPr>
+      <w:r>
+        <w:rPr>
+          <w:rFonts w:ascii="Arial" w:hAnsi="Arial"/>
+          <w:b/>
+          <w:color w:val="9A6815"/>
+          <w:sz w:val="24"/>
+        </w:rPr>
+        <w:t>D. Franchise Sponsorships, Media Rights &amp; Brand Alliances</w:t>
+      </w:r>
+    </w:p>
+    <w:p>
+      <w:r>
+        <w:t>Commercial monetization through regional franchise league ownership (Alliance Premier Kabaddi League, State Badminton League), title sponsorships, banner advertisements, and live streaming rights.</w:t>
+      </w:r>
+    </w:p>
+    <w:p>
+      <w:pPr>
+        <w:pStyle w:val="ListBullet"/>
+        <w:spacing w:after="40"/>
+      </w:pPr>
+      <w:r>
+        <w:t>Title &amp; Associate Sponsors: Brand alliances with FMCG, footwear, and sports gear companies.</w:t>
+      </w:r>
+    </w:p>
+    <w:p>
+      <w:pPr>
+        <w:pStyle w:val="ListBullet"/>
+        <w:spacing w:after="40"/>
+      </w:pPr>
+      <w:r>
+        <w:t>Franchise Rights: Sale of regional team franchises to local business leaders (₹10L - ₹25L franchise fee).</w:t>
+      </w:r>
+    </w:p>
+    <w:p>
+      <w:pPr>
+        <w:pStyle w:val="ListBullet"/>
+        <w:spacing w:after="40"/>
+      </w:pPr>
+      <w:r>
+        <w:t>Digital &amp; Streaming Ads: Banner placements and live stream ad insertions on the portal and mobile app.</w:t>
+      </w:r>
+    </w:p>
+    <w:p>
+      <w:pPr>
+        <w:spacing w:before="160" w:after="40"/>
+      </w:pPr>
+      <w:r>
+        <w:rPr>
+          <w:rFonts w:ascii="Arial" w:hAnsi="Arial"/>
+          <w:b/>
+          <w:color w:val="9A6815"/>
+          <w:sz w:val="24"/>
+        </w:rPr>
+        <w:t>E. CSR Grants &amp; NSDF Co-Funding Channel</w:t>
+      </w:r>
+    </w:p>
+    <w:p>
+      <w:r>
+        <w:t>Leveraging Section 135 CSR guidelines and NSDF 100% tax-deductible contributions to build open-access sports grounds in underprivileged panchayat schools.</w:t>
+      </w:r>
+    </w:p>
+    <w:p>
+      <w:pPr>
+        <w:pStyle w:val="ListBullet"/>
+        <w:spacing w:after="40"/>
+      </w:pPr>
+      <w:r>
+        <w:t>Corporate CSR Partnerships: Co-branding sports grounds with corporate CSR partners (e.g., Tata Steel, JSW, Adani).</w:t>
+      </w:r>
+    </w:p>
+    <w:p>
+      <w:pPr>
+        <w:pStyle w:val="ListBullet"/>
+        <w:spacing w:after="40"/>
+      </w:pPr>
+      <w:r>
+        <w:t>Government Subsidies: Tapping MYAS &amp; Khelo India infrastructure grants for rural sports hall buildouts.</w:t>
+      </w:r>
+    </w:p>
+    <w:p>
+      <w:pPr>
+        <w:spacing w:after="120"/>
+      </w:pPr>
+    </w:p>
+    <w:p>
+      <w:r>
+        <w:rPr>
+          <w:rFonts w:ascii="Arial" w:hAnsi="Arial"/>
+          <w:b/>
+          <w:color w:val="041A4D"/>
+          <w:sz w:val="26"/>
+        </w:rPr>
+        <w:t>Financial Summary &amp; 3-Year Revenue Projections (INR Cr)</w:t>
+      </w:r>
+    </w:p>
+    <w:tbl>
+      <w:tblPr>
+        <w:tblW w:type="auto" w:w="0"/>
+        <w:jc w:val="center"/>
+        <w:tblLayout w:type="fixed"/>
+        <w:tblLook w:firstColumn="1" w:firstRow="1" w:lastColumn="0" w:lastRow="0" w:noHBand="0" w:noVBand="1" w:val="04A0"/>
+      </w:tblPr>
+      <w:tblGrid>
+        <w:gridCol w:w="1419"/>
+        <w:gridCol w:w="1419"/>
+        <w:gridCol w:w="1419"/>
+        <w:gridCol w:w="1419"/>
+        <w:gridCol w:w="1419"/>
+        <w:gridCol w:w="1419"/>
+        <w:gridCol w:w="1419"/>
+      </w:tblGrid>
+      <w:tr>
+        <w:tc>
+          <w:tcPr>
+            <w:tcW w:type="dxa" w:w="2016"/>
+            <w:tcMar>
+              <w:top w:w="100" w:type="dxa"/>
+              <w:bottom w:w="100" w:type="dxa"/>
+              <w:left w:w="100" w:type="dxa"/>
+              <w:right w:w="100" w:type="dxa"/>
+            </w:tcMar>
+            <w:shd w:fill="041A4D"/>
+          </w:tcPr>
+          <w:p>
+            <w:pPr>
+              <w:spacing w:after="40" w:line="252" w:lineRule="auto"/>
+            </w:pPr>
+            <w:r>
+              <w:rPr>
+                <w:rFonts w:ascii="Calibri" w:hAnsi="Calibri"/>
+                <w:b/>
+                <w:color w:val="FFFFFF"/>
+                <w:sz w:val="18"/>
+              </w:rPr>
+              <w:t>Revenue Stream</w:t>
+            </w:r>
+          </w:p>
+        </w:tc>
+        <w:tc>
+          <w:tcPr>
+            <w:tcW w:type="dxa" w:w="2160"/>
+            <w:tcMar>
+              <w:top w:w="100" w:type="dxa"/>
+              <w:bottom w:w="100" w:type="dxa"/>
+              <w:left w:w="100" w:type="dxa"/>
+              <w:right w:w="100" w:type="dxa"/>
+            </w:tcMar>
+            <w:shd w:fill="041A4D"/>
+          </w:tcPr>
+          <w:p>
+            <w:pPr>
+              <w:spacing w:after="40" w:line="252" w:lineRule="auto"/>
+            </w:pPr>
+            <w:r>
+              <w:rPr>
+                <w:rFonts w:ascii="Calibri" w:hAnsi="Calibri"/>
+                <w:b/>
+                <w:color w:val="FFFFFF"/>
+                <w:sz w:val="18"/>
+              </w:rPr>
+              <w:t>Monetization Mechanism</w:t>
+            </w:r>
+          </w:p>
+        </w:tc>
+        <w:tc>
+          <w:tcPr>
+            <w:tcW w:type="dxa" w:w="1296"/>
+            <w:tcMar>
+              <w:top w:w="100" w:type="dxa"/>
+              <w:bottom w:w="100" w:type="dxa"/>
+              <w:left w:w="100" w:type="dxa"/>
+              <w:right w:w="100" w:type="dxa"/>
+            </w:tcMar>
+            <w:shd w:fill="041A4D"/>
+          </w:tcPr>
+          <w:p>
+            <w:pPr>
+              <w:spacing w:after="40" w:line="252" w:lineRule="auto"/>
+            </w:pPr>
+            <w:r>
+              <w:rPr>
+                <w:rFonts w:ascii="Calibri" w:hAnsi="Calibri"/>
+                <w:b/>
+                <w:color w:val="FFFFFF"/>
+                <w:sz w:val="18"/>
+              </w:rPr>
+              <w:t>Gross Margin %</w:t>
+            </w:r>
+          </w:p>
+        </w:tc>
+        <w:tc>
+          <w:tcPr>
+            <w:tcW w:type="dxa" w:w="1152"/>
+            <w:tcMar>
+              <w:top w:w="100" w:type="dxa"/>
+              <w:bottom w:w="100" w:type="dxa"/>
+              <w:left w:w="100" w:type="dxa"/>
+              <w:right w:w="100" w:type="dxa"/>
+            </w:tcMar>
+            <w:shd w:fill="041A4D"/>
+          </w:tcPr>
+          <w:p>
+            <w:pPr>
+              <w:spacing w:after="40" w:line="252" w:lineRule="auto"/>
+            </w:pPr>
+            <w:r>
+              <w:rPr>
+                <w:rFonts w:ascii="Calibri" w:hAnsi="Calibri"/>
+                <w:b/>
+                <w:color w:val="FFFFFF"/>
+                <w:sz w:val="18"/>
+              </w:rPr>
+              <w:t>Year 1 (₹ Cr)</w:t>
+            </w:r>
+          </w:p>
+        </w:tc>
+        <w:tc>
+          <w:tcPr>
+            <w:tcW w:type="dxa" w:w="1152"/>
+            <w:tcMar>
+              <w:top w:w="100" w:type="dxa"/>
+              <w:bottom w:w="100" w:type="dxa"/>
+              <w:left w:w="100" w:type="dxa"/>
+              <w:right w:w="100" w:type="dxa"/>
+            </w:tcMar>
+            <w:shd w:fill="041A4D"/>
+          </w:tcPr>
+          <w:p>
+            <w:pPr>
+              <w:spacing w:after="40" w:line="252" w:lineRule="auto"/>
+            </w:pPr>
+            <w:r>
+              <w:rPr>
+                <w:rFonts w:ascii="Calibri" w:hAnsi="Calibri"/>
+                <w:b/>
+                <w:color w:val="FFFFFF"/>
+                <w:sz w:val="18"/>
+              </w:rPr>
+              <w:t>Year 2 (₹ Cr)</w:t>
+            </w:r>
+          </w:p>
+        </w:tc>
+        <w:tc>
+          <w:tcPr>
+            <w:tcW w:type="dxa" w:w="1152"/>
+            <w:tcMar>
+              <w:top w:w="100" w:type="dxa"/>
+              <w:bottom w:w="100" w:type="dxa"/>
+              <w:left w:w="100" w:type="dxa"/>
+              <w:right w:w="100" w:type="dxa"/>
+            </w:tcMar>
+            <w:shd w:fill="041A4D"/>
+          </w:tcPr>
+          <w:p>
+            <w:pPr>
+              <w:spacing w:after="40" w:line="252" w:lineRule="auto"/>
+            </w:pPr>
+            <w:r>
+              <w:rPr>
+                <w:rFonts w:ascii="Calibri" w:hAnsi="Calibri"/>
+                <w:b/>
+                <w:color w:val="FFFFFF"/>
+                <w:sz w:val="18"/>
+              </w:rPr>
+              <w:t>Year 3 (₹ Cr)</w:t>
+            </w:r>
+          </w:p>
+        </w:tc>
+        <w:tc>
+          <w:tcPr>
+            <w:tcW w:type="dxa" w:w="2304"/>
+            <w:tcMar>
+              <w:top w:w="100" w:type="dxa"/>
+              <w:bottom w:w="100" w:type="dxa"/>
+              <w:left w:w="100" w:type="dxa"/>
+              <w:right w:w="100" w:type="dxa"/>
+            </w:tcMar>
+            <w:shd w:fill="041A4D"/>
+          </w:tcPr>
+          <w:p>
+            <w:pPr>
+              <w:spacing w:after="40" w:line="252" w:lineRule="auto"/>
+            </w:pPr>
+            <w:r>
+              <w:rPr>
+                <w:rFonts w:ascii="Calibri" w:hAnsi="Calibri"/>
+                <w:b/>
+                <w:color w:val="FFFFFF"/>
+                <w:sz w:val="18"/>
+              </w:rPr>
+              <w:t>Key Growth Driver</w:t>
+            </w:r>
+          </w:p>
+        </w:tc>
+      </w:tr>
+      <w:tr>
+        <w:tc>
+          <w:tcPr>
+            <w:tcW w:type="dxa" w:w="2016"/>
+            <w:tcMar>
+              <w:top w:w="100" w:type="dxa"/>
+              <w:bottom w:w="100" w:type="dxa"/>
+              <w:left w:w="100" w:type="dxa"/>
+              <w:right w:w="100" w:type="dxa"/>
+            </w:tcMar>
+            <w:shd w:fill="F7F9FC"/>
+          </w:tcPr>
+          <w:p>
+            <w:pPr>
+              <w:spacing w:after="40" w:line="252" w:lineRule="auto"/>
+            </w:pPr>
+            <w:r>
+              <w:rPr>
+                <w:rFonts w:ascii="Calibri" w:hAnsi="Calibri"/>
+                <w:b/>
+                <w:sz w:val="18"/>
+              </w:rPr>
+              <w:t>Infrastructure Court Rentals &amp; PPP</w:t>
+            </w:r>
+          </w:p>
+        </w:tc>
+        <w:tc>
+          <w:tcPr>
+            <w:tcW w:type="dxa" w:w="2160"/>
+            <w:tcMar>
+              <w:top w:w="100" w:type="dxa"/>
+              <w:bottom w:w="100" w:type="dxa"/>
+              <w:left w:w="100" w:type="dxa"/>
+              <w:right w:w="100" w:type="dxa"/>
+            </w:tcMar>
+            <w:shd w:fill="F7F9FC"/>
+          </w:tcPr>
+          <w:p>
+            <w:pPr>
+              <w:spacing w:after="40" w:line="252" w:lineRule="auto"/>
+            </w:pPr>
+            <w:r>
+              <w:rPr>
+                <w:rFonts w:ascii="Calibri" w:hAnsi="Calibri"/>
+                <w:sz w:val="18"/>
+              </w:rPr>
+              <w:t>Hourly court bookings &amp; evening floodlight leasing</w:t>
+            </w:r>
+          </w:p>
+        </w:tc>
+        <w:tc>
+          <w:tcPr>
+            <w:tcW w:type="dxa" w:w="1296"/>
+            <w:tcMar>
+              <w:top w:w="100" w:type="dxa"/>
+              <w:bottom w:w="100" w:type="dxa"/>
+              <w:left w:w="100" w:type="dxa"/>
+              <w:right w:w="100" w:type="dxa"/>
+            </w:tcMar>
+            <w:shd w:fill="F7F9FC"/>
+          </w:tcPr>
+          <w:p>
+            <w:pPr>
+              <w:spacing w:after="40" w:line="252" w:lineRule="auto"/>
+            </w:pPr>
+            <w:r>
+              <w:rPr>
+                <w:rFonts w:ascii="Calibri" w:hAnsi="Calibri"/>
+                <w:sz w:val="18"/>
+              </w:rPr>
+              <w:t>65% - 72%</w:t>
+            </w:r>
+          </w:p>
+        </w:tc>
+        <w:tc>
+          <w:tcPr>
+            <w:tcW w:type="dxa" w:w="1152"/>
+            <w:tcMar>
+              <w:top w:w="100" w:type="dxa"/>
+              <w:bottom w:w="100" w:type="dxa"/>
+              <w:left w:w="100" w:type="dxa"/>
+              <w:right w:w="100" w:type="dxa"/>
+            </w:tcMar>
+            <w:shd w:fill="F7F9FC"/>
+          </w:tcPr>
+          <w:p>
+            <w:pPr>
+              <w:spacing w:after="40" w:line="252" w:lineRule="auto"/>
+            </w:pPr>
+            <w:r>
+              <w:rPr>
+                <w:rFonts w:ascii="Calibri" w:hAnsi="Calibri"/>
+                <w:sz w:val="18"/>
+              </w:rPr>
+              <w:t>₹ 1.80 Cr</w:t>
+            </w:r>
+          </w:p>
+        </w:tc>
+        <w:tc>
+          <w:tcPr>
+            <w:tcW w:type="dxa" w:w="1152"/>
+            <w:tcMar>
+              <w:top w:w="100" w:type="dxa"/>
+              <w:bottom w:w="100" w:type="dxa"/>
+              <w:left w:w="100" w:type="dxa"/>
+              <w:right w:w="100" w:type="dxa"/>
+            </w:tcMar>
+            <w:shd w:fill="F7F9FC"/>
+          </w:tcPr>
+          <w:p>
+            <w:pPr>
+              <w:spacing w:after="40" w:line="252" w:lineRule="auto"/>
+            </w:pPr>
+            <w:r>
+              <w:rPr>
+                <w:rFonts w:ascii="Calibri" w:hAnsi="Calibri"/>
+                <w:sz w:val="18"/>
+              </w:rPr>
+              <w:t>₹ 4.50 Cr</w:t>
+            </w:r>
+          </w:p>
+        </w:tc>
+        <w:tc>
+          <w:tcPr>
+            <w:tcW w:type="dxa" w:w="1152"/>
+            <w:tcMar>
+              <w:top w:w="100" w:type="dxa"/>
+              <w:bottom w:w="100" w:type="dxa"/>
+              <w:left w:w="100" w:type="dxa"/>
+              <w:right w:w="100" w:type="dxa"/>
+            </w:tcMar>
+            <w:shd w:fill="F7F9FC"/>
+          </w:tcPr>
+          <w:p>
+            <w:pPr>
+              <w:spacing w:after="40" w:line="252" w:lineRule="auto"/>
+            </w:pPr>
+            <w:r>
+              <w:rPr>
+                <w:rFonts w:ascii="Calibri" w:hAnsi="Calibri"/>
+                <w:sz w:val="18"/>
+              </w:rPr>
+              <w:t>₹ 9.20 Cr</w:t>
+            </w:r>
+          </w:p>
+        </w:tc>
+        <w:tc>
+          <w:tcPr>
+            <w:tcW w:type="dxa" w:w="2304"/>
+            <w:tcMar>
+              <w:top w:w="100" w:type="dxa"/>
+              <w:bottom w:w="100" w:type="dxa"/>
+              <w:left w:w="100" w:type="dxa"/>
+              <w:right w:w="100" w:type="dxa"/>
+            </w:tcMar>
+            <w:shd w:fill="F7F9FC"/>
+          </w:tcPr>
+          <w:p>
+            <w:pPr>
+              <w:spacing w:after="40" w:line="252" w:lineRule="auto"/>
+            </w:pPr>
+            <w:r>
+              <w:rPr>
+                <w:rFonts w:ascii="Calibri" w:hAnsi="Calibri"/>
+                <w:sz w:val="18"/>
+              </w:rPr>
+              <w:t>Expansion to 50+ panchayat sports hubs</w:t>
+            </w:r>
+          </w:p>
+        </w:tc>
+      </w:tr>
+      <w:tr>
+        <w:tc>
+          <w:tcPr>
+            <w:tcW w:type="dxa" w:w="2016"/>
+            <w:tcMar>
+              <w:top w:w="100" w:type="dxa"/>
+              <w:bottom w:w="100" w:type="dxa"/>
+              <w:left w:w="100" w:type="dxa"/>
+              <w:right w:w="100" w:type="dxa"/>
+            </w:tcMar>
+            <w:shd w:fill="FFFFFF"/>
+          </w:tcPr>
+          <w:p>
+            <w:pPr>
+              <w:spacing w:after="40" w:line="252" w:lineRule="auto"/>
+            </w:pPr>
+            <w:r>
+              <w:rPr>
+                <w:rFonts w:ascii="Calibri" w:hAnsi="Calibri"/>
+                <w:b/>
+                <w:sz w:val="18"/>
+              </w:rPr>
+              <w:t>Vendor Procurement Commissions</w:t>
+            </w:r>
+          </w:p>
+        </w:tc>
+        <w:tc>
+          <w:tcPr>
+            <w:tcW w:type="dxa" w:w="2160"/>
+            <w:tcMar>
+              <w:top w:w="100" w:type="dxa"/>
+              <w:bottom w:w="100" w:type="dxa"/>
+              <w:left w:w="100" w:type="dxa"/>
+              <w:right w:w="100" w:type="dxa"/>
+            </w:tcMar>
+            <w:shd w:fill="FFFFFF"/>
+          </w:tcPr>
+          <w:p>
+            <w:pPr>
+              <w:spacing w:after="40" w:line="252" w:lineRule="auto"/>
+            </w:pPr>
+            <w:r>
+              <w:rPr>
+                <w:rFonts w:ascii="Calibri" w:hAnsi="Calibri"/>
+                <w:sz w:val="18"/>
+              </w:rPr>
+              <w:t>3% - 7% fee on bulk gear &amp; turf equipment orders</w:t>
+            </w:r>
+          </w:p>
+        </w:tc>
+        <w:tc>
+          <w:tcPr>
+            <w:tcW w:type="dxa" w:w="1296"/>
+            <w:tcMar>
+              <w:top w:w="100" w:type="dxa"/>
+              <w:bottom w:w="100" w:type="dxa"/>
+              <w:left w:w="100" w:type="dxa"/>
+              <w:right w:w="100" w:type="dxa"/>
+            </w:tcMar>
+            <w:shd w:fill="FFFFFF"/>
+          </w:tcPr>
+          <w:p>
+            <w:pPr>
+              <w:spacing w:after="40" w:line="252" w:lineRule="auto"/>
+            </w:pPr>
+            <w:r>
+              <w:rPr>
+                <w:rFonts w:ascii="Calibri" w:hAnsi="Calibri"/>
+                <w:sz w:val="18"/>
+              </w:rPr>
+              <w:t>80% - 85%</w:t>
+            </w:r>
+          </w:p>
+        </w:tc>
+        <w:tc>
+          <w:tcPr>
+            <w:tcW w:type="dxa" w:w="1152"/>
+            <w:tcMar>
+              <w:top w:w="100" w:type="dxa"/>
+              <w:bottom w:w="100" w:type="dxa"/>
+              <w:left w:w="100" w:type="dxa"/>
+              <w:right w:w="100" w:type="dxa"/>
+            </w:tcMar>
+            <w:shd w:fill="FFFFFF"/>
+          </w:tcPr>
+          <w:p>
+            <w:pPr>
+              <w:spacing w:after="40" w:line="252" w:lineRule="auto"/>
+            </w:pPr>
+            <w:r>
+              <w:rPr>
+                <w:rFonts w:ascii="Calibri" w:hAnsi="Calibri"/>
+                <w:sz w:val="18"/>
+              </w:rPr>
+              <w:t>₹ 0.75 Cr</w:t>
+            </w:r>
+          </w:p>
+        </w:tc>
+        <w:tc>
+          <w:tcPr>
+            <w:tcW w:type="dxa" w:w="1152"/>
+            <w:tcMar>
+              <w:top w:w="100" w:type="dxa"/>
+              <w:bottom w:w="100" w:type="dxa"/>
+              <w:left w:w="100" w:type="dxa"/>
+              <w:right w:w="100" w:type="dxa"/>
+            </w:tcMar>
+            <w:shd w:fill="FFFFFF"/>
+          </w:tcPr>
+          <w:p>
+            <w:pPr>
+              <w:spacing w:after="40" w:line="252" w:lineRule="auto"/>
+            </w:pPr>
+            <w:r>
+              <w:rPr>
+                <w:rFonts w:ascii="Calibri" w:hAnsi="Calibri"/>
+                <w:sz w:val="18"/>
+              </w:rPr>
+              <w:t>₹ 2.10 Cr</w:t>
+            </w:r>
+          </w:p>
+        </w:tc>
+        <w:tc>
+          <w:tcPr>
+            <w:tcW w:type="dxa" w:w="1152"/>
+            <w:tcMar>
+              <w:top w:w="100" w:type="dxa"/>
+              <w:bottom w:w="100" w:type="dxa"/>
+              <w:left w:w="100" w:type="dxa"/>
+              <w:right w:w="100" w:type="dxa"/>
+            </w:tcMar>
+            <w:shd w:fill="FFFFFF"/>
+          </w:tcPr>
+          <w:p>
+            <w:pPr>
+              <w:spacing w:after="40" w:line="252" w:lineRule="auto"/>
+            </w:pPr>
+            <w:r>
+              <w:rPr>
+                <w:rFonts w:ascii="Calibri" w:hAnsi="Calibri"/>
+                <w:sz w:val="18"/>
+              </w:rPr>
+              <w:t>₹ 4.80 Cr</w:t>
+            </w:r>
+          </w:p>
+        </w:tc>
+        <w:tc>
+          <w:tcPr>
+            <w:tcW w:type="dxa" w:w="2304"/>
+            <w:tcMar>
+              <w:top w:w="100" w:type="dxa"/>
+              <w:bottom w:w="100" w:type="dxa"/>
+              <w:left w:w="100" w:type="dxa"/>
+              <w:right w:w="100" w:type="dxa"/>
+            </w:tcMar>
+            <w:shd w:fill="FFFFFF"/>
+          </w:tcPr>
+          <w:p>
+            <w:pPr>
+              <w:spacing w:after="40" w:line="252" w:lineRule="auto"/>
+            </w:pPr>
+            <w:r>
+              <w:rPr>
+                <w:rFonts w:ascii="Calibri" w:hAnsi="Calibri"/>
+                <w:sz w:val="18"/>
+              </w:rPr>
+              <w:t>Onboarding 150+ verified sports vendors</w:t>
+            </w:r>
+          </w:p>
+        </w:tc>
+      </w:tr>
+      <w:tr>
+        <w:tc>
+          <w:tcPr>
+            <w:tcW w:type="dxa" w:w="2016"/>
+            <w:tcMar>
+              <w:top w:w="100" w:type="dxa"/>
+              <w:bottom w:w="100" w:type="dxa"/>
+              <w:left w:w="100" w:type="dxa"/>
+              <w:right w:w="100" w:type="dxa"/>
+            </w:tcMar>
+            <w:shd w:fill="F7F9FC"/>
+          </w:tcPr>
+          <w:p>
+            <w:pPr>
+              <w:spacing w:after="40" w:line="252" w:lineRule="auto"/>
+            </w:pPr>
+            <w:r>
+              <w:rPr>
+                <w:rFonts w:ascii="Calibri" w:hAnsi="Calibri"/>
+                <w:b/>
+                <w:sz w:val="18"/>
+              </w:rPr>
+              <w:t>Tournament &amp; Academy Licensing</w:t>
+            </w:r>
+          </w:p>
+        </w:tc>
+        <w:tc>
+          <w:tcPr>
+            <w:tcW w:type="dxa" w:w="2160"/>
+            <w:tcMar>
+              <w:top w:w="100" w:type="dxa"/>
+              <w:bottom w:w="100" w:type="dxa"/>
+              <w:left w:w="100" w:type="dxa"/>
+              <w:right w:w="100" w:type="dxa"/>
+            </w:tcMar>
+            <w:shd w:fill="F7F9FC"/>
+          </w:tcPr>
+          <w:p>
+            <w:pPr>
+              <w:spacing w:after="40" w:line="252" w:lineRule="auto"/>
+            </w:pPr>
+            <w:r>
+              <w:rPr>
+                <w:rFonts w:ascii="Calibri" w:hAnsi="Calibri"/>
+                <w:sz w:val="18"/>
+              </w:rPr>
+              <w:t>Entry fees &amp; district academy affiliation packages</w:t>
+            </w:r>
+          </w:p>
+        </w:tc>
+        <w:tc>
+          <w:tcPr>
+            <w:tcW w:type="dxa" w:w="1296"/>
+            <w:tcMar>
+              <w:top w:w="100" w:type="dxa"/>
+              <w:bottom w:w="100" w:type="dxa"/>
+              <w:left w:w="100" w:type="dxa"/>
+              <w:right w:w="100" w:type="dxa"/>
+            </w:tcMar>
+            <w:shd w:fill="F7F9FC"/>
+          </w:tcPr>
+          <w:p>
+            <w:pPr>
+              <w:spacing w:after="40" w:line="252" w:lineRule="auto"/>
+            </w:pPr>
+            <w:r>
+              <w:rPr>
+                <w:rFonts w:ascii="Calibri" w:hAnsi="Calibri"/>
+                <w:sz w:val="18"/>
+              </w:rPr>
+              <w:t>75% - 80%</w:t>
+            </w:r>
+          </w:p>
+        </w:tc>
+        <w:tc>
+          <w:tcPr>
+            <w:tcW w:type="dxa" w:w="1152"/>
+            <w:tcMar>
+              <w:top w:w="100" w:type="dxa"/>
+              <w:bottom w:w="100" w:type="dxa"/>
+              <w:left w:w="100" w:type="dxa"/>
+              <w:right w:w="100" w:type="dxa"/>
+            </w:tcMar>
+            <w:shd w:fill="F7F9FC"/>
+          </w:tcPr>
+          <w:p>
+            <w:pPr>
+              <w:spacing w:after="40" w:line="252" w:lineRule="auto"/>
+            </w:pPr>
+            <w:r>
+              <w:rPr>
+                <w:rFonts w:ascii="Calibri" w:hAnsi="Calibri"/>
+                <w:sz w:val="18"/>
+              </w:rPr>
+              <w:t>₹ 0.60 Cr</w:t>
+            </w:r>
+          </w:p>
+        </w:tc>
+        <w:tc>
+          <w:tcPr>
+            <w:tcW w:type="dxa" w:w="1152"/>
+            <w:tcMar>
+              <w:top w:w="100" w:type="dxa"/>
+              <w:bottom w:w="100" w:type="dxa"/>
+              <w:left w:w="100" w:type="dxa"/>
+              <w:right w:w="100" w:type="dxa"/>
+            </w:tcMar>
+            <w:shd w:fill="F7F9FC"/>
+          </w:tcPr>
+          <w:p>
+            <w:pPr>
+              <w:spacing w:after="40" w:line="252" w:lineRule="auto"/>
+            </w:pPr>
+            <w:r>
+              <w:rPr>
+                <w:rFonts w:ascii="Calibri" w:hAnsi="Calibri"/>
+                <w:sz w:val="18"/>
+              </w:rPr>
+              <w:t>₹ 1.65 Cr</w:t>
+            </w:r>
+          </w:p>
+        </w:tc>
+        <w:tc>
+          <w:tcPr>
+            <w:tcW w:type="dxa" w:w="1152"/>
+            <w:tcMar>
+              <w:top w:w="100" w:type="dxa"/>
+              <w:bottom w:w="100" w:type="dxa"/>
+              <w:left w:w="100" w:type="dxa"/>
+              <w:right w:w="100" w:type="dxa"/>
+            </w:tcMar>
+            <w:shd w:fill="F7F9FC"/>
+          </w:tcPr>
+          <w:p>
+            <w:pPr>
+              <w:spacing w:after="40" w:line="252" w:lineRule="auto"/>
+            </w:pPr>
+            <w:r>
+              <w:rPr>
+                <w:rFonts w:ascii="Calibri" w:hAnsi="Calibri"/>
+                <w:sz w:val="18"/>
+              </w:rPr>
+              <w:t>₹ 3.40 Cr</w:t>
+            </w:r>
+          </w:p>
+        </w:tc>
+        <w:tc>
+          <w:tcPr>
+            <w:tcW w:type="dxa" w:w="2304"/>
+            <w:tcMar>
+              <w:top w:w="100" w:type="dxa"/>
+              <w:bottom w:w="100" w:type="dxa"/>
+              <w:left w:w="100" w:type="dxa"/>
+              <w:right w:w="100" w:type="dxa"/>
+            </w:tcMar>
+            <w:shd w:fill="F7F9FC"/>
+          </w:tcPr>
+          <w:p>
+            <w:pPr>
+              <w:spacing w:after="40" w:line="252" w:lineRule="auto"/>
+            </w:pPr>
+            <w:r>
+              <w:rPr>
+                <w:rFonts w:ascii="Calibri" w:hAnsi="Calibri"/>
+                <w:sz w:val="18"/>
+              </w:rPr>
+              <w:t>15+ state championships &amp; 25k athletes</w:t>
+            </w:r>
+          </w:p>
+        </w:tc>
+      </w:tr>
+      <w:tr>
+        <w:tc>
+          <w:tcPr>
+            <w:tcW w:type="dxa" w:w="2016"/>
+            <w:tcMar>
+              <w:top w:w="100" w:type="dxa"/>
+              <w:bottom w:w="100" w:type="dxa"/>
+              <w:left w:w="100" w:type="dxa"/>
+              <w:right w:w="100" w:type="dxa"/>
+            </w:tcMar>
+            <w:shd w:fill="FFFFFF"/>
+          </w:tcPr>
+          <w:p>
+            <w:pPr>
+              <w:spacing w:after="40" w:line="252" w:lineRule="auto"/>
+            </w:pPr>
+            <w:r>
+              <w:rPr>
+                <w:rFonts w:ascii="Calibri" w:hAnsi="Calibri"/>
+                <w:b/>
+                <w:sz w:val="18"/>
+              </w:rPr>
+              <w:t>Franchise Leagues &amp; Sponsorships</w:t>
+            </w:r>
+          </w:p>
+        </w:tc>
+        <w:tc>
+          <w:tcPr>
+            <w:tcW w:type="dxa" w:w="2160"/>
+            <w:tcMar>
+              <w:top w:w="100" w:type="dxa"/>
+              <w:bottom w:w="100" w:type="dxa"/>
+              <w:left w:w="100" w:type="dxa"/>
+              <w:right w:w="100" w:type="dxa"/>
+            </w:tcMar>
+            <w:shd w:fill="FFFFFF"/>
+          </w:tcPr>
+          <w:p>
+            <w:pPr>
+              <w:spacing w:after="40" w:line="252" w:lineRule="auto"/>
+            </w:pPr>
+            <w:r>
+              <w:rPr>
+                <w:rFonts w:ascii="Calibri" w:hAnsi="Calibri"/>
+                <w:sz w:val="18"/>
+              </w:rPr>
+              <w:t>Title sponsorships &amp; regional franchise team sales</w:t>
+            </w:r>
+          </w:p>
+        </w:tc>
+        <w:tc>
+          <w:tcPr>
+            <w:tcW w:type="dxa" w:w="1296"/>
+            <w:tcMar>
+              <w:top w:w="100" w:type="dxa"/>
+              <w:bottom w:w="100" w:type="dxa"/>
+              <w:left w:w="100" w:type="dxa"/>
+              <w:right w:w="100" w:type="dxa"/>
+            </w:tcMar>
+            <w:shd w:fill="FFFFFF"/>
+          </w:tcPr>
+          <w:p>
+            <w:pPr>
+              <w:spacing w:after="40" w:line="252" w:lineRule="auto"/>
+            </w:pPr>
+            <w:r>
+              <w:rPr>
+                <w:rFonts w:ascii="Calibri" w:hAnsi="Calibri"/>
+                <w:sz w:val="18"/>
+              </w:rPr>
+              <w:t>70% - 75%</w:t>
+            </w:r>
+          </w:p>
+        </w:tc>
+        <w:tc>
+          <w:tcPr>
+            <w:tcW w:type="dxa" w:w="1152"/>
+            <w:tcMar>
+              <w:top w:w="100" w:type="dxa"/>
+              <w:bottom w:w="100" w:type="dxa"/>
+              <w:left w:w="100" w:type="dxa"/>
+              <w:right w:w="100" w:type="dxa"/>
+            </w:tcMar>
+            <w:shd w:fill="FFFFFF"/>
+          </w:tcPr>
+          <w:p>
+            <w:pPr>
+              <w:spacing w:after="40" w:line="252" w:lineRule="auto"/>
+            </w:pPr>
+            <w:r>
+              <w:rPr>
+                <w:rFonts w:ascii="Calibri" w:hAnsi="Calibri"/>
+                <w:sz w:val="18"/>
+              </w:rPr>
+              <w:t>₹ 1.20 Cr</w:t>
+            </w:r>
+          </w:p>
+        </w:tc>
+        <w:tc>
+          <w:tcPr>
+            <w:tcW w:type="dxa" w:w="1152"/>
+            <w:tcMar>
+              <w:top w:w="100" w:type="dxa"/>
+              <w:bottom w:w="100" w:type="dxa"/>
+              <w:left w:w="100" w:type="dxa"/>
+              <w:right w:w="100" w:type="dxa"/>
+            </w:tcMar>
+            <w:shd w:fill="FFFFFF"/>
+          </w:tcPr>
+          <w:p>
+            <w:pPr>
+              <w:spacing w:after="40" w:line="252" w:lineRule="auto"/>
+            </w:pPr>
+            <w:r>
+              <w:rPr>
+                <w:rFonts w:ascii="Calibri" w:hAnsi="Calibri"/>
+                <w:sz w:val="18"/>
+              </w:rPr>
+              <w:t>₹ 3.80 Cr</w:t>
+            </w:r>
+          </w:p>
+        </w:tc>
+        <w:tc>
+          <w:tcPr>
+            <w:tcW w:type="dxa" w:w="1152"/>
+            <w:tcMar>
+              <w:top w:w="100" w:type="dxa"/>
+              <w:bottom w:w="100" w:type="dxa"/>
+              <w:left w:w="100" w:type="dxa"/>
+              <w:right w:w="100" w:type="dxa"/>
+            </w:tcMar>
+            <w:shd w:fill="FFFFFF"/>
+          </w:tcPr>
+          <w:p>
+            <w:pPr>
+              <w:spacing w:after="40" w:line="252" w:lineRule="auto"/>
+            </w:pPr>
+            <w:r>
+              <w:rPr>
+                <w:rFonts w:ascii="Calibri" w:hAnsi="Calibri"/>
+                <w:sz w:val="18"/>
+              </w:rPr>
+              <w:t>₹ 8.50 Cr</w:t>
+            </w:r>
+          </w:p>
+        </w:tc>
+        <w:tc>
+          <w:tcPr>
+            <w:tcW w:type="dxa" w:w="2304"/>
+            <w:tcMar>
+              <w:top w:w="100" w:type="dxa"/>
+              <w:bottom w:w="100" w:type="dxa"/>
+              <w:left w:w="100" w:type="dxa"/>
+              <w:right w:w="100" w:type="dxa"/>
+            </w:tcMar>
+            <w:shd w:fill="FFFFFF"/>
+          </w:tcPr>
+          <w:p>
+            <w:pPr>
+              <w:spacing w:after="40" w:line="252" w:lineRule="auto"/>
+            </w:pPr>
+            <w:r>
+              <w:rPr>
+                <w:rFonts w:ascii="Calibri" w:hAnsi="Calibri"/>
+                <w:sz w:val="18"/>
+              </w:rPr>
+              <w:t>Launch of Alliance Premier Kabaddi League</w:t>
+            </w:r>
+          </w:p>
+        </w:tc>
+      </w:tr>
+      <w:tr>
+        <w:tc>
+          <w:tcPr>
+            <w:tcW w:type="dxa" w:w="2016"/>
+            <w:tcMar>
+              <w:top w:w="100" w:type="dxa"/>
+              <w:bottom w:w="100" w:type="dxa"/>
+              <w:left w:w="100" w:type="dxa"/>
+              <w:right w:w="100" w:type="dxa"/>
+            </w:tcMar>
+            <w:shd w:fill="F7F9FC"/>
+          </w:tcPr>
+          <w:p>
+            <w:pPr>
+              <w:spacing w:after="40" w:line="252" w:lineRule="auto"/>
+            </w:pPr>
+            <w:r>
+              <w:rPr>
+                <w:rFonts w:ascii="Calibri" w:hAnsi="Calibri"/>
+                <w:b/>
+                <w:sz w:val="18"/>
+              </w:rPr>
+              <w:t>CSR Partnerships &amp; Grants</w:t>
+            </w:r>
+          </w:p>
+        </w:tc>
+        <w:tc>
+          <w:tcPr>
+            <w:tcW w:type="dxa" w:w="2160"/>
+            <w:tcMar>
+              <w:top w:w="100" w:type="dxa"/>
+              <w:bottom w:w="100" w:type="dxa"/>
+              <w:left w:w="100" w:type="dxa"/>
+              <w:right w:w="100" w:type="dxa"/>
+            </w:tcMar>
+            <w:shd w:fill="F7F9FC"/>
+          </w:tcPr>
+          <w:p>
+            <w:pPr>
+              <w:spacing w:after="40" w:line="252" w:lineRule="auto"/>
+            </w:pPr>
+            <w:r>
+              <w:rPr>
+                <w:rFonts w:ascii="Calibri" w:hAnsi="Calibri"/>
+                <w:sz w:val="18"/>
+              </w:rPr>
+              <w:t>100% tax-deductible CSR co-funding for school hubs</w:t>
+            </w:r>
+          </w:p>
+        </w:tc>
+        <w:tc>
+          <w:tcPr>
+            <w:tcW w:type="dxa" w:w="1296"/>
+            <w:tcMar>
+              <w:top w:w="100" w:type="dxa"/>
+              <w:bottom w:w="100" w:type="dxa"/>
+              <w:left w:w="100" w:type="dxa"/>
+              <w:right w:w="100" w:type="dxa"/>
+            </w:tcMar>
+            <w:shd w:fill="F7F9FC"/>
+          </w:tcPr>
+          <w:p>
+            <w:pPr>
+              <w:spacing w:after="40" w:line="252" w:lineRule="auto"/>
+            </w:pPr>
+            <w:r>
+              <w:rPr>
+                <w:rFonts w:ascii="Calibri" w:hAnsi="Calibri"/>
+                <w:sz w:val="18"/>
+              </w:rPr>
+              <w:t>90% - 95%</w:t>
+            </w:r>
+          </w:p>
+        </w:tc>
+        <w:tc>
+          <w:tcPr>
+            <w:tcW w:type="dxa" w:w="1152"/>
+            <w:tcMar>
+              <w:top w:w="100" w:type="dxa"/>
+              <w:bottom w:w="100" w:type="dxa"/>
+              <w:left w:w="100" w:type="dxa"/>
+              <w:right w:w="100" w:type="dxa"/>
+            </w:tcMar>
+            <w:shd w:fill="F7F9FC"/>
+          </w:tcPr>
+          <w:p>
+            <w:pPr>
+              <w:spacing w:after="40" w:line="252" w:lineRule="auto"/>
+            </w:pPr>
+            <w:r>
+              <w:rPr>
+                <w:rFonts w:ascii="Calibri" w:hAnsi="Calibri"/>
+                <w:sz w:val="18"/>
+              </w:rPr>
+              <w:t>₹ 0.90 Cr</w:t>
+            </w:r>
+          </w:p>
+        </w:tc>
+        <w:tc>
+          <w:tcPr>
+            <w:tcW w:type="dxa" w:w="1152"/>
+            <w:tcMar>
+              <w:top w:w="100" w:type="dxa"/>
+              <w:bottom w:w="100" w:type="dxa"/>
+              <w:left w:w="100" w:type="dxa"/>
+              <w:right w:w="100" w:type="dxa"/>
+            </w:tcMar>
+            <w:shd w:fill="F7F9FC"/>
+          </w:tcPr>
+          <w:p>
+            <w:pPr>
+              <w:spacing w:after="40" w:line="252" w:lineRule="auto"/>
+            </w:pPr>
+            <w:r>
+              <w:rPr>
+                <w:rFonts w:ascii="Calibri" w:hAnsi="Calibri"/>
+                <w:sz w:val="18"/>
+              </w:rPr>
+              <w:t>₹ 2.40 Cr</w:t>
+            </w:r>
+          </w:p>
+        </w:tc>
+        <w:tc>
+          <w:tcPr>
+            <w:tcW w:type="dxa" w:w="1152"/>
+            <w:tcMar>
+              <w:top w:w="100" w:type="dxa"/>
+              <w:bottom w:w="100" w:type="dxa"/>
+              <w:left w:w="100" w:type="dxa"/>
+              <w:right w:w="100" w:type="dxa"/>
+            </w:tcMar>
+            <w:shd w:fill="F7F9FC"/>
+          </w:tcPr>
+          <w:p>
+            <w:pPr>
+              <w:spacing w:after="40" w:line="252" w:lineRule="auto"/>
+            </w:pPr>
+            <w:r>
+              <w:rPr>
+                <w:rFonts w:ascii="Calibri" w:hAnsi="Calibri"/>
+                <w:sz w:val="18"/>
+              </w:rPr>
+              <w:t>₹ 5.10 Cr</w:t>
+            </w:r>
+          </w:p>
+        </w:tc>
+        <w:tc>
+          <w:tcPr>
+            <w:tcW w:type="dxa" w:w="2304"/>
+            <w:tcMar>
+              <w:top w:w="100" w:type="dxa"/>
+              <w:bottom w:w="100" w:type="dxa"/>
+              <w:left w:w="100" w:type="dxa"/>
+              <w:right w:w="100" w:type="dxa"/>
+            </w:tcMar>
+            <w:shd w:fill="F7F9FC"/>
+          </w:tcPr>
+          <w:p>
+            <w:pPr>
+              <w:spacing w:after="40" w:line="252" w:lineRule="auto"/>
+            </w:pPr>
+            <w:r>
+              <w:rPr>
+                <w:rFonts w:ascii="Calibri" w:hAnsi="Calibri"/>
+                <w:sz w:val="18"/>
+              </w:rPr>
+              <w:t>CSR alliances with top 10 corporate houses</w:t>
+            </w:r>
+          </w:p>
+        </w:tc>
+      </w:tr>
+      <w:tr>
+        <w:tc>
+          <w:tcPr>
+            <w:tcW w:type="dxa" w:w="2016"/>
+            <w:tcMar>
+              <w:top w:w="100" w:type="dxa"/>
+              <w:bottom w:w="100" w:type="dxa"/>
+              <w:left w:w="100" w:type="dxa"/>
+              <w:right w:w="100" w:type="dxa"/>
+            </w:tcMar>
+            <w:shd w:fill="E6EEF8"/>
+          </w:tcPr>
+          <w:p>
+            <w:pPr>
+              <w:spacing w:after="40" w:line="252" w:lineRule="auto"/>
+            </w:pPr>
+            <w:r>
+              <w:rPr>
+                <w:rFonts w:ascii="Calibri" w:hAnsi="Calibri"/>
+                <w:b/>
+                <w:color w:val="041A4D"/>
+                <w:sz w:val="18"/>
+              </w:rPr>
+              <w:t>TOTAL ESTIMATED REVENUE</w:t>
+            </w:r>
+          </w:p>
+        </w:tc>
+        <w:tc>
+          <w:tcPr>
+            <w:tcW w:type="dxa" w:w="2160"/>
+            <w:tcMar>
+              <w:top w:w="100" w:type="dxa"/>
+              <w:bottom w:w="100" w:type="dxa"/>
+              <w:left w:w="100" w:type="dxa"/>
+              <w:right w:w="100" w:type="dxa"/>
+            </w:tcMar>
+            <w:shd w:fill="E6EEF8"/>
+          </w:tcPr>
+          <w:p>
+            <w:pPr>
+              <w:spacing w:after="40" w:line="252" w:lineRule="auto"/>
+            </w:pPr>
+            <w:r>
+              <w:rPr>
+                <w:rFonts w:ascii="Calibri" w:hAnsi="Calibri"/>
+                <w:b/>
+                <w:color w:val="041A4D"/>
+                <w:sz w:val="18"/>
+              </w:rPr>
+              <w:t>Combined Multi-Stream Ecosystem Output</w:t>
+            </w:r>
+          </w:p>
+        </w:tc>
+        <w:tc>
+          <w:tcPr>
+            <w:tcW w:type="dxa" w:w="1296"/>
+            <w:tcMar>
+              <w:top w:w="100" w:type="dxa"/>
+              <w:bottom w:w="100" w:type="dxa"/>
+              <w:left w:w="100" w:type="dxa"/>
+              <w:right w:w="100" w:type="dxa"/>
+            </w:tcMar>
+            <w:shd w:fill="E6EEF8"/>
+          </w:tcPr>
+          <w:p>
+            <w:pPr>
+              <w:spacing w:after="40" w:line="252" w:lineRule="auto"/>
+            </w:pPr>
+            <w:r>
+              <w:rPr>
+                <w:rFonts w:ascii="Calibri" w:hAnsi="Calibri"/>
+                <w:b/>
+                <w:color w:val="041A4D"/>
+                <w:sz w:val="18"/>
+              </w:rPr>
+              <w:t>74% (Avg)</w:t>
+            </w:r>
+          </w:p>
+        </w:tc>
+        <w:tc>
+          <w:tcPr>
+            <w:tcW w:type="dxa" w:w="1152"/>
+            <w:tcMar>
+              <w:top w:w="100" w:type="dxa"/>
+              <w:bottom w:w="100" w:type="dxa"/>
+              <w:left w:w="100" w:type="dxa"/>
+              <w:right w:w="100" w:type="dxa"/>
+            </w:tcMar>
+            <w:shd w:fill="E6EEF8"/>
+          </w:tcPr>
+          <w:p>
+            <w:pPr>
+              <w:spacing w:after="40" w:line="252" w:lineRule="auto"/>
+            </w:pPr>
+            <w:r>
+              <w:rPr>
+                <w:rFonts w:ascii="Calibri" w:hAnsi="Calibri"/>
+                <w:b/>
+                <w:color w:val="041A4D"/>
+                <w:sz w:val="18"/>
+              </w:rPr>
+              <w:t>₹ 5.25 Cr</w:t>
+            </w:r>
+          </w:p>
+        </w:tc>
+        <w:tc>
+          <w:tcPr>
+            <w:tcW w:type="dxa" w:w="1152"/>
+            <w:tcMar>
+              <w:top w:w="100" w:type="dxa"/>
+              <w:bottom w:w="100" w:type="dxa"/>
+              <w:left w:w="100" w:type="dxa"/>
+              <w:right w:w="100" w:type="dxa"/>
+            </w:tcMar>
+            <w:shd w:fill="E6EEF8"/>
+          </w:tcPr>
+          <w:p>
+            <w:pPr>
+              <w:spacing w:after="40" w:line="252" w:lineRule="auto"/>
+            </w:pPr>
+            <w:r>
+              <w:rPr>
+                <w:rFonts w:ascii="Calibri" w:hAnsi="Calibri"/>
+                <w:b/>
+                <w:color w:val="041A4D"/>
+                <w:sz w:val="18"/>
+              </w:rPr>
+              <w:t>₹ 14.45 Cr</w:t>
+            </w:r>
+          </w:p>
+        </w:tc>
+        <w:tc>
+          <w:tcPr>
+            <w:tcW w:type="dxa" w:w="1152"/>
+            <w:tcMar>
+              <w:top w:w="100" w:type="dxa"/>
+              <w:bottom w:w="100" w:type="dxa"/>
+              <w:left w:w="100" w:type="dxa"/>
+              <w:right w:w="100" w:type="dxa"/>
+            </w:tcMar>
+            <w:shd w:fill="E6EEF8"/>
+          </w:tcPr>
+          <w:p>
+            <w:pPr>
+              <w:spacing w:after="40" w:line="252" w:lineRule="auto"/>
+            </w:pPr>
+            <w:r>
+              <w:rPr>
+                <w:rFonts w:ascii="Calibri" w:hAnsi="Calibri"/>
+                <w:b/>
+                <w:color w:val="041A4D"/>
+                <w:sz w:val="18"/>
+              </w:rPr>
+              <w:t>₹ 31.00 Cr</w:t>
+            </w:r>
+          </w:p>
+        </w:tc>
+        <w:tc>
+          <w:tcPr>
+            <w:tcW w:type="dxa" w:w="2304"/>
+            <w:tcMar>
+              <w:top w:w="100" w:type="dxa"/>
+              <w:bottom w:w="100" w:type="dxa"/>
+              <w:left w:w="100" w:type="dxa"/>
+              <w:right w:w="100" w:type="dxa"/>
+            </w:tcMar>
+            <w:shd w:fill="E6EEF8"/>
+          </w:tcPr>
+          <w:p>
+            <w:pPr>
+              <w:spacing w:after="40" w:line="252" w:lineRule="auto"/>
+            </w:pPr>
+            <w:r>
+              <w:rPr>
+                <w:rFonts w:ascii="Calibri" w:hAnsi="Calibri"/>
+                <w:b/>
+                <w:color w:val="041A4D"/>
+                <w:sz w:val="18"/>
+              </w:rPr>
+              <w:t>Compound Annual Growth Rate (CAGR) ~142%</w:t>
+            </w:r>
+          </w:p>
+        </w:tc>
+      </w:tr>
+    </w:tbl>
+    <w:p>
+      <w:pPr>
+        <w:spacing w:after="360"/>
+      </w:pPr>
+    </w:p>
+    <w:p>
+      <w:pPr>
+        <w:pStyle w:val="Heading1"/>
+      </w:pPr>
+      <w:r>
+        <w:rPr>
+          <w:rFonts w:ascii="Arial" w:hAnsi="Arial"/>
+          <w:b/>
+          <w:color w:val="041A4D"/>
+          <w:sz w:val="32"/>
+        </w:rPr>
+        <w:t>5. Strategic Recommendations &amp; Technological Edge</w:t>
       </w:r>
     </w:p>
     <w:p>

</xml_diff>